<commit_message>
Aggiunta Comando: Comando Commit File Specifici
</commit_message>
<xml_diff>
--- a/ComandiGit.docx
+++ b/ComandiGit.docx
@@ -7,79 +7,23 @@
         <w:pStyle w:val="Titolo1"/>
       </w:pPr>
       <w:r>
-        <w:t>Creazione di un branch</w:t>
-      </w:r>
-    </w:p>
-    <w:p>
-      <w:r>
-        <w:t xml:space="preserve">Per prima cosa eseguire una pull request sul main per averlo aggiornato tramite comando </w:t>
-      </w:r>
-      <w:r>
-        <w:rPr>
-          <w:highlight w:val="green"/>
-        </w:rPr>
-        <w:t>git pull</w:t>
-      </w:r>
-      <w:r>
-        <w:t>.</w:t>
-      </w:r>
-    </w:p>
-    <w:p>
-      <w:r>
-        <w:t>Dopodiché occorre creare un branch in locale con il comando:</w:t>
-      </w:r>
-    </w:p>
-    <w:p>
-      <w:r>
-        <w:rPr>
-          <w:highlight w:val="green"/>
-        </w:rPr>
-        <w:t xml:space="preserve">git checkout -b </w:t>
-      </w:r>
-      <w:r>
-        <w:rPr>
-          <w:i/>
-          <w:iCs/>
-          <w:highlight w:val="green"/>
-        </w:rPr>
-        <w:t>nomeNuovoBranch</w:t>
-      </w:r>
-      <w:r>
-        <w:rPr>
-          <w:i/>
-          <w:iCs/>
-        </w:rPr>
-        <w:t xml:space="preserve"> </w:t>
-      </w:r>
-      <w:r>
-        <w:t>(Questo crea il branch solo in locale, non visibile sul server remoto)</w:t>
-      </w:r>
-    </w:p>
-    <w:p>
-      <w:r>
-        <w:t>Per portarlo nel server remoto e metterlo a disposizione degli altri collaboratori:</w:t>
-      </w:r>
-    </w:p>
-    <w:p>
-      <w:pPr>
-        <w:rPr>
-          <w:i/>
-          <w:iCs/>
-        </w:rPr>
-      </w:pPr>
-      <w:r>
-        <w:rPr>
-          <w:highlight w:val="green"/>
-        </w:rPr>
-        <w:t xml:space="preserve">git push -u origin </w:t>
-      </w:r>
-      <w:r>
-        <w:rPr>
-          <w:i/>
-          <w:iCs/>
-          <w:highlight w:val="green"/>
-        </w:rPr>
-        <w:t>nomeNuovoBranch</w:t>
+        <w:t>Commit</w:t>
+      </w:r>
+    </w:p>
+    <w:p>
+      <w:r>
+        <w:t>Se abbiamo modificato molti file durante il nostro lavoro in locale ma vogliamo fare la commit di alcuni specifici come ad esempio, abbiamo tanti file con estensioni diverse ma ci interessa fare il commit e poi il push di soli file .java possiamo lanciare il comando:</w:t>
+      </w:r>
+    </w:p>
+    <w:p>
+      <w:r>
+        <w:rPr>
+          <w:highlight w:val="green"/>
+        </w:rPr>
+        <w:t>git add *.java</w:t>
+      </w:r>
+      <w:r>
+        <w:t xml:space="preserve"> (L’asterisco indica tutti i file di quel tipo)</w:t>
       </w:r>
     </w:p>
     <w:p>
@@ -87,110 +31,79 @@
         <w:pStyle w:val="Titolo1"/>
       </w:pPr>
       <w:r>
-        <w:t>Merge dei Branch</w:t>
-      </w:r>
-    </w:p>
-    <w:p>
-      <w:r>
-        <w:t xml:space="preserve">Per prima cosa bisogna andare sul branch in cui vogliamo portare le modifche di un branch in cui siamo avanti. Supponiamo di essere nel branch: </w:t>
+        <w:t>Creazione di un branch</w:t>
+      </w:r>
+    </w:p>
+    <w:p>
+      <w:r>
+        <w:t xml:space="preserve">Per prima cosa eseguire una pull request sul main per averlo aggiornato tramite comando </w:t>
+      </w:r>
+      <w:r>
+        <w:rPr>
+          <w:highlight w:val="green"/>
+        </w:rPr>
+        <w:t>git pull</w:t>
+      </w:r>
+      <w:r>
+        <w:t>.</w:t>
+      </w:r>
+    </w:p>
+    <w:p>
+      <w:r>
+        <w:t>Dopodiché occorre creare un branch in locale con il comando:</w:t>
+      </w:r>
+    </w:p>
+    <w:p>
+      <w:r>
+        <w:rPr>
+          <w:highlight w:val="green"/>
+        </w:rPr>
+        <w:t xml:space="preserve">git checkout -b </w:t>
       </w:r>
       <w:r>
         <w:rPr>
           <w:i/>
           <w:iCs/>
-        </w:rPr>
-        <w:t>“sviluppoMatteo”</w:t>
-      </w:r>
-      <w:r>
-        <w:t xml:space="preserve"> che ha portato il progetto avanti di 5 commit rispetto al main da cui si è staccato, in questo caso dobbiamo fare il merge di </w:t>
+          <w:highlight w:val="green"/>
+        </w:rPr>
+        <w:t>nomeNuovoBranch</w:t>
       </w:r>
       <w:r>
         <w:rPr>
           <w:i/>
           <w:iCs/>
         </w:rPr>
-        <w:t xml:space="preserve">“sviluppoMatteo” </w:t>
-      </w:r>
-      <w:r>
-        <w:t xml:space="preserve">con il branch </w:t>
-      </w:r>
-      <w:r>
+        <w:t xml:space="preserve"> </w:t>
+      </w:r>
+      <w:r>
+        <w:t>(Questo crea il branch solo in locale, non visibile sul server remoto)</w:t>
+      </w:r>
+    </w:p>
+    <w:p>
+      <w:r>
+        <w:t>Per portarlo nel server remoto e metterlo a disposizione degli altri collaboratori:</w:t>
+      </w:r>
+    </w:p>
+    <w:p>
+      <w:pPr>
         <w:rPr>
           <w:i/>
           <w:iCs/>
         </w:rPr>
-        <w:t xml:space="preserve">“main” </w:t>
-      </w:r>
-      <w:r>
-        <w:t>per rendere definitive le sue modifiche.</w:t>
-      </w:r>
-    </w:p>
-    <w:p>
-      <w:r>
-        <w:t>Spostiamoci quindi sul branch main se non ci siam già con il comando:</w:t>
-      </w:r>
-    </w:p>
-    <w:p>
-      <w:r>
-        <w:rPr>
-          <w:highlight w:val="green"/>
-        </w:rPr>
-        <w:t>git checkout main</w:t>
-      </w:r>
-    </w:p>
-    <w:p>
-      <w:r>
-        <w:t>Sicuri di aver salvato tutto in entrambi i branch e di essere sul branch da aggiornare (main in questo caso) lanciamo:</w:t>
-      </w:r>
-    </w:p>
-    <w:p>
-      <w:pPr>
+      </w:pPr>
+      <w:r>
+        <w:rPr>
+          <w:highlight w:val="green"/>
+        </w:rPr>
+        <w:t xml:space="preserve">git push -u origin </w:t>
+      </w:r>
+      <w:r>
         <w:rPr>
           <w:i/>
           <w:iCs/>
-        </w:rPr>
-      </w:pPr>
-      <w:r>
-        <w:rPr>
-          <w:highlight w:val="green"/>
-        </w:rPr>
-        <w:t xml:space="preserve">git merge sviluppoMatteo -m </w:t>
-      </w:r>
-      <w:r>
-        <w:rPr>
-          <w:i/>
-          <w:iCs/>
-          <w:highlight w:val="green"/>
-        </w:rPr>
-        <w:t>“Commento sul perché del merge”</w:t>
-      </w:r>
-    </w:p>
-    <w:p>
-      <w:r>
-        <w:t>Per completare il tutto fare la push nel branch appena unito con il merge:</w:t>
-      </w:r>
-    </w:p>
-    <w:p>
-      <w:r>
-        <w:rPr>
-          <w:highlight w:val="green"/>
-        </w:rPr>
-        <w:t>git push</w:t>
-      </w:r>
-    </w:p>
-    <w:p>
-      <w:r>
-        <w:t xml:space="preserve">Ho fatto l’esempio con due branch generici, questo procedimento si può svolgere anche al contrario se il branch </w:t>
-      </w:r>
-      <w:r>
-        <w:rPr>
-          <w:i/>
-          <w:iCs/>
-        </w:rPr>
-        <w:t xml:space="preserve">“sviluppoMatteo” </w:t>
-      </w:r>
-      <w:r>
-        <w:t>è rimasto indietro.</w:t>
+          <w:highlight w:val="green"/>
+        </w:rPr>
+        <w:t>nomeNuovoBranch</w:t>
       </w:r>
     </w:p>
     <w:p>
@@ -198,37 +111,148 @@
         <w:pStyle w:val="Titolo1"/>
       </w:pPr>
       <w:r>
-        <w:t>Eliminazione di un branch</w:t>
-      </w:r>
-    </w:p>
-    <w:p>
-      <w:r>
-        <w:t>Per prima cosa occorre</w:t>
-      </w:r>
-      <w:r>
-        <w:t xml:space="preserve"> salvare tutto e poi</w:t>
-      </w:r>
-      <w:r>
-        <w:t xml:space="preserve"> spostarsi fuori dal branch che vogliamo eliminare, supponiamo di essere nel branch “</w:t>
+        <w:t>Merge dei Branch</w:t>
+      </w:r>
+    </w:p>
+    <w:p>
+      <w:r>
+        <w:t xml:space="preserve">Per prima cosa bisogna andare sul branch in cui vogliamo portare le modifche di un branch in cui siamo avanti. Supponiamo di essere nel branch: </w:t>
       </w:r>
       <w:r>
         <w:rPr>
           <w:i/>
           <w:iCs/>
         </w:rPr>
-        <w:t>b”</w:t>
-      </w:r>
-      <w:r>
-        <w:t xml:space="preserve">, per prima cosa ci spostiamo sul branch </w:t>
+        <w:t>“sviluppoMatteo”</w:t>
+      </w:r>
+      <w:r>
+        <w:t xml:space="preserve"> che ha portato il progetto avanti di 5 commit rispetto al main da cui si è staccato, in questo caso dobbiamo fare il merge di </w:t>
       </w:r>
       <w:r>
         <w:rPr>
           <w:i/>
           <w:iCs/>
         </w:rPr>
+        <w:t xml:space="preserve">“sviluppoMatteo” </w:t>
+      </w:r>
+      <w:r>
+        <w:t xml:space="preserve">con il branch </w:t>
+      </w:r>
+      <w:r>
+        <w:rPr>
+          <w:i/>
+          <w:iCs/>
+        </w:rPr>
         <w:t xml:space="preserve">“main” </w:t>
       </w:r>
       <w:r>
+        <w:t>per rendere definitive le sue modifiche.</w:t>
+      </w:r>
+    </w:p>
+    <w:p>
+      <w:r>
+        <w:t>Spostiamoci quindi sul branch main se non ci siam già con il comando:</w:t>
+      </w:r>
+    </w:p>
+    <w:p>
+      <w:r>
+        <w:rPr>
+          <w:highlight w:val="green"/>
+        </w:rPr>
+        <w:t>git checkout main</w:t>
+      </w:r>
+    </w:p>
+    <w:p>
+      <w:r>
+        <w:t>Sicuri di aver salvato tutto in entrambi i branch e di essere sul branch da aggiornare (main in questo caso) lanciamo:</w:t>
+      </w:r>
+    </w:p>
+    <w:p>
+      <w:pPr>
+        <w:rPr>
+          <w:i/>
+          <w:iCs/>
+        </w:rPr>
+      </w:pPr>
+      <w:r>
+        <w:rPr>
+          <w:highlight w:val="green"/>
+        </w:rPr>
+        <w:t xml:space="preserve">git merge sviluppoMatteo -m </w:t>
+      </w:r>
+      <w:r>
+        <w:rPr>
+          <w:i/>
+          <w:iCs/>
+          <w:highlight w:val="green"/>
+        </w:rPr>
+        <w:t>“Commento sul perché del merge”</w:t>
+      </w:r>
+    </w:p>
+    <w:p>
+      <w:r>
+        <w:t>Per completare il tutto fare la push nel branch appena unito con il merge:</w:t>
+      </w:r>
+    </w:p>
+    <w:p>
+      <w:r>
+        <w:rPr>
+          <w:highlight w:val="green"/>
+        </w:rPr>
+        <w:t>git push</w:t>
+      </w:r>
+    </w:p>
+    <w:p>
+      <w:r>
+        <w:t xml:space="preserve">Ho fatto l’esempio con due branch generici, questo procedimento si può svolgere anche al contrario se il branch </w:t>
+      </w:r>
+      <w:r>
+        <w:rPr>
+          <w:i/>
+          <w:iCs/>
+        </w:rPr>
+        <w:t xml:space="preserve">“sviluppoMatteo” </w:t>
+      </w:r>
+      <w:r>
+        <w:t>è rimasto indietro.</w:t>
+      </w:r>
+    </w:p>
+    <w:p>
+      <w:pPr>
+        <w:pStyle w:val="Titolo1"/>
+      </w:pPr>
+      <w:r>
+        <w:t>Eliminazione di un branch</w:t>
+      </w:r>
+    </w:p>
+    <w:p>
+      <w:r>
+        <w:t>Per prima cosa occorre</w:t>
+      </w:r>
+      <w:r>
+        <w:t xml:space="preserve"> salvare tutto e poi</w:t>
+      </w:r>
+      <w:r>
+        <w:t xml:space="preserve"> spostarsi fuori dal branch che vogliamo eliminare, supponiamo di essere nel branch “</w:t>
+      </w:r>
+      <w:r>
+        <w:rPr>
+          <w:i/>
+          <w:iCs/>
+        </w:rPr>
+        <w:t>b”</w:t>
+      </w:r>
+      <w:r>
+        <w:t xml:space="preserve">, per prima cosa ci spostiamo sul branch </w:t>
+      </w:r>
+      <w:r>
+        <w:rPr>
+          <w:i/>
+          <w:iCs/>
+        </w:rPr>
+        <w:t xml:space="preserve">“main” </w:t>
+      </w:r>
+      <w:r>
         <w:t>tramite il comando:</w:t>
       </w:r>
     </w:p>
@@ -253,6 +277,7 @@
         <w:rPr>
           <w:highlight w:val="green"/>
         </w:rPr>
+        <w:lastRenderedPageBreak/>
         <w:t xml:space="preserve">git branch -d </w:t>
       </w:r>
       <w:r>

</xml_diff>

<commit_message>
Aggiunta Comando: Rimozione File
</commit_message>
<xml_diff>
--- a/ComandiGit.docx
+++ b/ComandiGit.docx
@@ -7,23 +7,85 @@
         <w:pStyle w:val="Titolo1"/>
       </w:pPr>
       <w:r>
-        <w:t>Commit</w:t>
-      </w:r>
-    </w:p>
-    <w:p>
-      <w:r>
-        <w:t>Se abbiamo modificato molti file durante il nostro lavoro in locale ma vogliamo fare la commit di alcuni specifici come ad esempio, abbiamo tanti file con estensioni diverse ma ci interessa fare il commit e poi il push di soli file .java possiamo lanciare il comando:</w:t>
-      </w:r>
-    </w:p>
-    <w:p>
-      <w:r>
-        <w:rPr>
-          <w:highlight w:val="green"/>
-        </w:rPr>
-        <w:t>git add *.java</w:t>
-      </w:r>
-      <w:r>
-        <w:t xml:space="preserve"> (L’asterisco indica tutti i file di quel tipo)</w:t>
+        <w:t>Eliminazione file da git</w:t>
+      </w:r>
+    </w:p>
+    <w:p>
+      <w:r>
+        <w:t xml:space="preserve">Controllare i file che sta tracciando git: </w:t>
+      </w:r>
+      <w:r>
+        <w:rPr>
+          <w:highlight w:val="green"/>
+        </w:rPr>
+        <w:t>git ls-files</w:t>
+      </w:r>
+    </w:p>
+    <w:p>
+      <w:r>
+        <w:t xml:space="preserve">Rimuovere un file in remoto ma </w:t>
+      </w:r>
+      <w:r>
+        <w:rPr>
+          <w:color w:val="EE0000"/>
+        </w:rPr>
+        <w:t>lasciarlo sul locale</w:t>
+      </w:r>
+      <w:r>
+        <w:t xml:space="preserve">: </w:t>
+      </w:r>
+      <w:r>
+        <w:rPr>
+          <w:highlight w:val="green"/>
+        </w:rPr>
+        <w:t xml:space="preserve">git rm –cahed </w:t>
+      </w:r>
+      <w:r>
+        <w:rPr>
+          <w:i/>
+          <w:iCs/>
+          <w:highlight w:val="green"/>
+        </w:rPr>
+        <w:t>nomeFile</w:t>
+      </w:r>
+      <w:r>
+        <w:t xml:space="preserve"> </w:t>
+      </w:r>
+    </w:p>
+    <w:p>
+      <w:pPr>
+        <w:rPr>
+          <w:i/>
+          <w:iCs/>
+        </w:rPr>
+      </w:pPr>
+      <w:r>
+        <w:rPr>
+          <w:color w:val="EE0000"/>
+        </w:rPr>
+        <w:t>Rimuovere un file in locale e remoto</w:t>
+      </w:r>
+      <w:r>
+        <w:t xml:space="preserve">: </w:t>
+      </w:r>
+      <w:r>
+        <w:rPr>
+          <w:highlight w:val="green"/>
+        </w:rPr>
+        <w:t xml:space="preserve">git rm </w:t>
+      </w:r>
+      <w:r>
+        <w:rPr>
+          <w:i/>
+          <w:iCs/>
+          <w:highlight w:val="green"/>
+        </w:rPr>
+        <w:t>nomeFile</w:t>
+      </w:r>
+    </w:p>
+    <w:p>
+      <w:r>
+        <w:t>Ovviamnte per rendere effettive le modifiche sul remoto fare sempre commit e push</w:t>
       </w:r>
     </w:p>
     <w:p>
@@ -31,79 +93,26 @@
         <w:pStyle w:val="Titolo1"/>
       </w:pPr>
       <w:r>
-        <w:t>Creazione di un branch</w:t>
-      </w:r>
-    </w:p>
-    <w:p>
-      <w:r>
-        <w:t xml:space="preserve">Per prima cosa eseguire una pull request sul main per averlo aggiornato tramite comando </w:t>
-      </w:r>
-      <w:r>
-        <w:rPr>
-          <w:highlight w:val="green"/>
-        </w:rPr>
-        <w:t>git pull</w:t>
-      </w:r>
-      <w:r>
-        <w:t>.</w:t>
-      </w:r>
-    </w:p>
-    <w:p>
-      <w:r>
-        <w:t>Dopodiché occorre creare un branch in locale con il comando:</w:t>
-      </w:r>
-    </w:p>
-    <w:p>
-      <w:r>
-        <w:rPr>
-          <w:highlight w:val="green"/>
-        </w:rPr>
-        <w:t xml:space="preserve">git checkout -b </w:t>
-      </w:r>
-      <w:r>
-        <w:rPr>
-          <w:i/>
-          <w:iCs/>
-          <w:highlight w:val="green"/>
-        </w:rPr>
-        <w:t>nomeNuovoBranch</w:t>
-      </w:r>
-      <w:r>
-        <w:rPr>
-          <w:i/>
-          <w:iCs/>
-        </w:rPr>
-        <w:t xml:space="preserve"> </w:t>
-      </w:r>
-      <w:r>
-        <w:t>(Questo crea il branch solo in locale, non visibile sul server remoto)</w:t>
-      </w:r>
-    </w:p>
-    <w:p>
-      <w:r>
-        <w:t>Per portarlo nel server remoto e metterlo a disposizione degli altri collaboratori:</w:t>
-      </w:r>
-    </w:p>
-    <w:p>
-      <w:pPr>
-        <w:rPr>
-          <w:i/>
-          <w:iCs/>
-        </w:rPr>
-      </w:pPr>
-      <w:r>
-        <w:rPr>
-          <w:highlight w:val="green"/>
-        </w:rPr>
-        <w:t xml:space="preserve">git push -u origin </w:t>
-      </w:r>
-      <w:r>
-        <w:rPr>
-          <w:i/>
-          <w:iCs/>
-          <w:highlight w:val="green"/>
-        </w:rPr>
-        <w:t>nomeNuovoBranch</w:t>
+        <w:t>Commit</w:t>
+      </w:r>
+      <w:r>
+        <w:t xml:space="preserve"> File Specifici</w:t>
+      </w:r>
+    </w:p>
+    <w:p>
+      <w:r>
+        <w:t>Se abbiamo modificato molti file durante il nostro lavoro in locale ma vogliamo fare la commit di alcuni specifici come ad esempio, abbiamo tanti file con estensioni diverse ma ci interessa fare il commit e poi il push di soli file .java possiamo lanciare il comando:</w:t>
+      </w:r>
+    </w:p>
+    <w:p>
+      <w:r>
+        <w:rPr>
+          <w:highlight w:val="green"/>
+        </w:rPr>
+        <w:t>git add *.java</w:t>
+      </w:r>
+      <w:r>
+        <w:t xml:space="preserve"> (L’asterisco indica tutti i file di quel tipo)</w:t>
       </w:r>
     </w:p>
     <w:p>
@@ -111,110 +120,79 @@
         <w:pStyle w:val="Titolo1"/>
       </w:pPr>
       <w:r>
-        <w:t>Merge dei Branch</w:t>
-      </w:r>
-    </w:p>
-    <w:p>
-      <w:r>
-        <w:t xml:space="preserve">Per prima cosa bisogna andare sul branch in cui vogliamo portare le modifche di un branch in cui siamo avanti. Supponiamo di essere nel branch: </w:t>
+        <w:t>Creazione di un branch</w:t>
+      </w:r>
+    </w:p>
+    <w:p>
+      <w:r>
+        <w:t xml:space="preserve">Per prima cosa eseguire una pull request sul main per averlo aggiornato tramite comando </w:t>
+      </w:r>
+      <w:r>
+        <w:rPr>
+          <w:highlight w:val="green"/>
+        </w:rPr>
+        <w:t>git pull</w:t>
+      </w:r>
+      <w:r>
+        <w:t>.</w:t>
+      </w:r>
+    </w:p>
+    <w:p>
+      <w:r>
+        <w:t>Dopodiché occorre creare un branch in locale con il comando:</w:t>
+      </w:r>
+    </w:p>
+    <w:p>
+      <w:r>
+        <w:rPr>
+          <w:highlight w:val="green"/>
+        </w:rPr>
+        <w:t xml:space="preserve">git checkout -b </w:t>
       </w:r>
       <w:r>
         <w:rPr>
           <w:i/>
           <w:iCs/>
-        </w:rPr>
-        <w:t>“sviluppoMatteo”</w:t>
-      </w:r>
-      <w:r>
-        <w:t xml:space="preserve"> che ha portato il progetto avanti di 5 commit rispetto al main da cui si è staccato, in questo caso dobbiamo fare il merge di </w:t>
+          <w:highlight w:val="green"/>
+        </w:rPr>
+        <w:t>nomeNuovoBranch</w:t>
       </w:r>
       <w:r>
         <w:rPr>
           <w:i/>
           <w:iCs/>
         </w:rPr>
-        <w:t xml:space="preserve">“sviluppoMatteo” </w:t>
-      </w:r>
-      <w:r>
-        <w:t xml:space="preserve">con il branch </w:t>
-      </w:r>
-      <w:r>
+        <w:t xml:space="preserve"> </w:t>
+      </w:r>
+      <w:r>
+        <w:t>(Questo crea il branch solo in locale, non visibile sul server remoto)</w:t>
+      </w:r>
+    </w:p>
+    <w:p>
+      <w:r>
+        <w:t>Per portarlo nel server remoto e metterlo a disposizione degli altri collaboratori:</w:t>
+      </w:r>
+    </w:p>
+    <w:p>
+      <w:pPr>
         <w:rPr>
           <w:i/>
           <w:iCs/>
         </w:rPr>
-        <w:t xml:space="preserve">“main” </w:t>
-      </w:r>
-      <w:r>
-        <w:t>per rendere definitive le sue modifiche.</w:t>
-      </w:r>
-    </w:p>
-    <w:p>
-      <w:r>
-        <w:t>Spostiamoci quindi sul branch main se non ci siam già con il comando:</w:t>
-      </w:r>
-    </w:p>
-    <w:p>
-      <w:r>
-        <w:rPr>
-          <w:highlight w:val="green"/>
-        </w:rPr>
-        <w:t>git checkout main</w:t>
-      </w:r>
-    </w:p>
-    <w:p>
-      <w:r>
-        <w:t>Sicuri di aver salvato tutto in entrambi i branch e di essere sul branch da aggiornare (main in questo caso) lanciamo:</w:t>
-      </w:r>
-    </w:p>
-    <w:p>
-      <w:pPr>
+      </w:pPr>
+      <w:r>
+        <w:rPr>
+          <w:highlight w:val="green"/>
+        </w:rPr>
+        <w:t xml:space="preserve">git push -u origin </w:t>
+      </w:r>
+      <w:r>
         <w:rPr>
           <w:i/>
           <w:iCs/>
-        </w:rPr>
-      </w:pPr>
-      <w:r>
-        <w:rPr>
-          <w:highlight w:val="green"/>
-        </w:rPr>
-        <w:t xml:space="preserve">git merge sviluppoMatteo -m </w:t>
-      </w:r>
-      <w:r>
-        <w:rPr>
-          <w:i/>
-          <w:iCs/>
-          <w:highlight w:val="green"/>
-        </w:rPr>
-        <w:t>“Commento sul perché del merge”</w:t>
-      </w:r>
-    </w:p>
-    <w:p>
-      <w:r>
-        <w:t>Per completare il tutto fare la push nel branch appena unito con il merge:</w:t>
-      </w:r>
-    </w:p>
-    <w:p>
-      <w:r>
-        <w:rPr>
-          <w:highlight w:val="green"/>
-        </w:rPr>
-        <w:t>git push</w:t>
-      </w:r>
-    </w:p>
-    <w:p>
-      <w:r>
-        <w:t xml:space="preserve">Ho fatto l’esempio con due branch generici, questo procedimento si può svolgere anche al contrario se il branch </w:t>
-      </w:r>
-      <w:r>
-        <w:rPr>
-          <w:i/>
-          <w:iCs/>
-        </w:rPr>
-        <w:t xml:space="preserve">“sviluppoMatteo” </w:t>
-      </w:r>
-      <w:r>
-        <w:t>è rimasto indietro.</w:t>
+          <w:highlight w:val="green"/>
+        </w:rPr>
+        <w:t>nomeNuovoBranch</w:t>
       </w:r>
     </w:p>
     <w:p>
@@ -222,37 +200,149 @@
         <w:pStyle w:val="Titolo1"/>
       </w:pPr>
       <w:r>
-        <w:t>Eliminazione di un branch</w:t>
-      </w:r>
-    </w:p>
-    <w:p>
-      <w:r>
-        <w:t>Per prima cosa occorre</w:t>
-      </w:r>
-      <w:r>
-        <w:t xml:space="preserve"> salvare tutto e poi</w:t>
-      </w:r>
-      <w:r>
-        <w:t xml:space="preserve"> spostarsi fuori dal branch che vogliamo eliminare, supponiamo di essere nel branch “</w:t>
+        <w:t>Merge dei Branch</w:t>
+      </w:r>
+    </w:p>
+    <w:p>
+      <w:r>
+        <w:t xml:space="preserve">Per prima cosa bisogna andare sul branch in cui vogliamo portare le modifche di un branch in cui siamo avanti. Supponiamo di essere nel branch: </w:t>
       </w:r>
       <w:r>
         <w:rPr>
           <w:i/>
           <w:iCs/>
         </w:rPr>
-        <w:t>b”</w:t>
-      </w:r>
-      <w:r>
-        <w:t xml:space="preserve">, per prima cosa ci spostiamo sul branch </w:t>
+        <w:t>“sviluppoMatteo”</w:t>
+      </w:r>
+      <w:r>
+        <w:t xml:space="preserve"> che ha portato il progetto avanti di 5 commit rispetto al main da cui si è staccato, in questo caso dobbiamo fare il merge di </w:t>
       </w:r>
       <w:r>
         <w:rPr>
           <w:i/>
           <w:iCs/>
         </w:rPr>
+        <w:t xml:space="preserve">“sviluppoMatteo” </w:t>
+      </w:r>
+      <w:r>
+        <w:t xml:space="preserve">con il branch </w:t>
+      </w:r>
+      <w:r>
+        <w:rPr>
+          <w:i/>
+          <w:iCs/>
+        </w:rPr>
         <w:t xml:space="preserve">“main” </w:t>
       </w:r>
       <w:r>
+        <w:t>per rendere definitive le sue modifiche.</w:t>
+      </w:r>
+    </w:p>
+    <w:p>
+      <w:r>
+        <w:t>Spostiamoci quindi sul branch main se non ci siam già con il comando:</w:t>
+      </w:r>
+    </w:p>
+    <w:p>
+      <w:r>
+        <w:rPr>
+          <w:highlight w:val="green"/>
+        </w:rPr>
+        <w:t>git checkout main</w:t>
+      </w:r>
+    </w:p>
+    <w:p>
+      <w:r>
+        <w:t>Sicuri di aver salvato tutto in entrambi i branch e di essere sul branch da aggiornare (main in questo caso) lanciamo:</w:t>
+      </w:r>
+    </w:p>
+    <w:p>
+      <w:pPr>
+        <w:rPr>
+          <w:i/>
+          <w:iCs/>
+        </w:rPr>
+      </w:pPr>
+      <w:r>
+        <w:rPr>
+          <w:highlight w:val="green"/>
+        </w:rPr>
+        <w:t xml:space="preserve">git merge sviluppoMatteo -m </w:t>
+      </w:r>
+      <w:r>
+        <w:rPr>
+          <w:i/>
+          <w:iCs/>
+          <w:highlight w:val="green"/>
+        </w:rPr>
+        <w:t>“Commento sul perché del merge”</w:t>
+      </w:r>
+    </w:p>
+    <w:p>
+      <w:r>
+        <w:t>Per completare il tutto fare la push nel branch appena unito con il merge:</w:t>
+      </w:r>
+    </w:p>
+    <w:p>
+      <w:r>
+        <w:rPr>
+          <w:highlight w:val="green"/>
+        </w:rPr>
+        <w:t>git push</w:t>
+      </w:r>
+    </w:p>
+    <w:p>
+      <w:r>
+        <w:t xml:space="preserve">Ho fatto l’esempio con due branch generici, questo procedimento si può svolgere anche al contrario se il branch </w:t>
+      </w:r>
+      <w:r>
+        <w:rPr>
+          <w:i/>
+          <w:iCs/>
+        </w:rPr>
+        <w:t xml:space="preserve">“sviluppoMatteo” </w:t>
+      </w:r>
+      <w:r>
+        <w:t>è rimasto indietro.</w:t>
+      </w:r>
+    </w:p>
+    <w:p>
+      <w:pPr>
+        <w:pStyle w:val="Titolo1"/>
+      </w:pPr>
+      <w:r>
+        <w:lastRenderedPageBreak/>
+        <w:t>Eliminazione di un branch</w:t>
+      </w:r>
+    </w:p>
+    <w:p>
+      <w:r>
+        <w:t>Per prima cosa occorre</w:t>
+      </w:r>
+      <w:r>
+        <w:t xml:space="preserve"> salvare tutto e poi</w:t>
+      </w:r>
+      <w:r>
+        <w:t xml:space="preserve"> spostarsi fuori dal branch che vogliamo eliminare, supponiamo di essere nel branch “</w:t>
+      </w:r>
+      <w:r>
+        <w:rPr>
+          <w:i/>
+          <w:iCs/>
+        </w:rPr>
+        <w:t>b”</w:t>
+      </w:r>
+      <w:r>
+        <w:t xml:space="preserve">, per prima cosa ci spostiamo sul branch </w:t>
+      </w:r>
+      <w:r>
+        <w:rPr>
+          <w:i/>
+          <w:iCs/>
+        </w:rPr>
+        <w:t xml:space="preserve">“main” </w:t>
+      </w:r>
+      <w:r>
         <w:t>tramite il comando:</w:t>
       </w:r>
     </w:p>
@@ -277,7 +367,6 @@
         <w:rPr>
           <w:highlight w:val="green"/>
         </w:rPr>
-        <w:lastRenderedPageBreak/>
         <w:t xml:space="preserve">git branch -d </w:t>
       </w:r>
       <w:r>

</xml_diff>

<commit_message>
Aggiunta Comando: Commit File Specifici
</commit_message>
<xml_diff>
--- a/ComandiGit.docx
+++ b/ComandiGit.docx
@@ -116,6 +116,17 @@
       </w:r>
     </w:p>
     <w:p>
+      <w:r>
+        <w:t xml:space="preserve">Se invece hai modificato dei file già tracciati e caricati sul remoto puoi fare la add soltanto di quelli con il comando: </w:t>
+      </w:r>
+      <w:r>
+        <w:rPr>
+          <w:highlight w:val="green"/>
+        </w:rPr>
+        <w:t>git add-u</w:t>
+      </w:r>
+    </w:p>
+    <w:p>
       <w:pPr>
         <w:pStyle w:val="Titolo1"/>
       </w:pPr>
@@ -293,6 +304,7 @@
     </w:p>
     <w:p>
       <w:r>
+        <w:lastRenderedPageBreak/>
         <w:t xml:space="preserve">Ho fatto l’esempio con due branch generici, questo procedimento si può svolgere anche al contrario se il branch </w:t>
       </w:r>
       <w:r>
@@ -311,7 +323,6 @@
         <w:pStyle w:val="Titolo1"/>
       </w:pPr>
       <w:r>
-        <w:lastRenderedPageBreak/>
         <w:t>Eliminazione di un branch</w:t>
       </w:r>
     </w:p>

</xml_diff>

<commit_message>
Aggiunta Comando: Eliminazione File
</commit_message>
<xml_diff>
--- a/ComandiGit.docx
+++ b/ComandiGit.docx
@@ -85,6 +85,26 @@
     </w:p>
     <w:p>
       <w:r>
+        <w:t xml:space="preserve">Per pulire da git file untracked puoi usare il comando: </w:t>
+      </w:r>
+      <w:r>
+        <w:rPr>
+          <w:highlight w:val="green"/>
+        </w:rPr>
+        <w:t>git clean -f</w:t>
+      </w:r>
+      <w:r>
+        <w:t xml:space="preserve"> puoi prima simulare però cosa andrebbe a togliere facendo: </w:t>
+      </w:r>
+      <w:r>
+        <w:rPr>
+          <w:highlight w:val="green"/>
+        </w:rPr>
+        <w:t>git clean -n</w:t>
+      </w:r>
+    </w:p>
+    <w:p>
+      <w:r>
         <w:t>Ovviamnte per rendere effettive le modifiche sul remoto fare sempre commit e push</w:t>
       </w:r>
     </w:p>
@@ -291,6 +311,7 @@
     </w:p>
     <w:p>
       <w:r>
+        <w:lastRenderedPageBreak/>
         <w:t>Per completare il tutto fare la push nel branch appena unito con il merge:</w:t>
       </w:r>
     </w:p>
@@ -304,7 +325,6 @@
     </w:p>
     <w:p>
       <w:r>
-        <w:lastRenderedPageBreak/>
         <w:t xml:space="preserve">Ho fatto l’esempio con due branch generici, questo procedimento si può svolgere anche al contrario se il branch </w:t>
       </w:r>
       <w:r>

</xml_diff>